<commit_message>
OV09 v3: pivot off the off-text osteo image to an embedded-wrong carry-forward on the post-acute coordination lane.
Deliverable pre-fills a discharge-home disposition with offloading teach-back, caregiver coverage, and equipment falsely marked settled; golden and grader catch the unmet contingencies against the nursing offloading flowsheet, case management, and family communication notes. Remove the radiograph image + osteo-image-spec; golden renamed golden-OV09.docx; grader 539 words; render_ov09_image.py kept as the off-text-image reference. prereg/design/run-instructions updated to v3. No cold bench (Dyrane tests by trajectory). verify_ondina + presubmit PASS.
</commit_message>
<xml_diff>
--- a/worlds/ondina-vasquell/phase-3-build-task-artifacts/platform/task9/current/started_post_acute_coordination_note_05242026.docx
+++ b/worlds/ondina-vasquell/phase-3-build-task-artifacts/platform/task9/current/started_post_acute_coordination_note_05242026.docx
@@ -592,7 +592,7 @@
           <w:color w:val="232830"/>
           <w:sz w:val="19"/>
         </w:rPr>
-        <w:t>Limb-threatening left diabetic foot infection admitted 05/16, debrided hospital day 2 with a granulating base and no exposed bone. Deep-tissue culture grew MSSA and Streptococcus agalactiae. Soft-tissue infection improving: afebrile, WBC normalized to 8.9. Osteomyelitis is not established on current data, the MRI marrow signal was equivocal and pathology showed no bone. On culture-directed, renally dosed intravenous antibiotics. AKI on CKD improving toward baseline.</w:t>
+        <w:t>Limb-threatening left diabetic foot infection admitted 05/16, debrided hospital day 2 with a granulating base and no exposed bone. Deep-tissue culture grew MSSA and Streptococcus agalactiae. Soft-tissue infection improving: afebrile, WBC normalized to 8.9. Osteomyelitis not established. On culture-directed, renally dosed intravenous antibiotics, with Infectious Disease setting the step-down and total duration. AKI on CKD improving toward baseline. The wound requires daily skilled dressing changes and strict offloading.</w:t>
       </w:r>
     </w:p>
     <w:p>
@@ -626,7 +626,7 @@
           <w:color w:val="232830"/>
           <w:sz w:val="19"/>
         </w:rPr>
-        <w:t>Antibiotics: continue culture-directed therapy; anticipate a short soft-tissue-infection course with step-down per Infectious Disease.</w:t>
+        <w:t>Antibiotics: continue culture-directed intravenous therapy; Infectious Disease to set the step-down and total duration.</w:t>
       </w:r>
     </w:p>
     <w:p>
@@ -642,7 +642,7 @@
           <w:color w:val="232830"/>
           <w:sz w:val="19"/>
         </w:rPr>
-        <w:t>Wound care: continue daily skilled dressing changes and strict offloading per podiatry and wound care.</w:t>
+        <w:t>Wound care: daily skilled dressing changes; offloading device in place and tolerated, offloading teach-back completed with the patient.</w:t>
       </w:r>
     </w:p>
     <w:p>
@@ -658,7 +658,7 @@
           <w:color w:val="232830"/>
           <w:sz w:val="19"/>
         </w:rPr>
-        <w:t>Therapy: continue skilled PT and OT; complete the stair assessment and offloading teach-back.</w:t>
+        <w:t>Caregiver support: the daughter is available to provide daily dressing changes and daytime supervision at home.</w:t>
       </w:r>
     </w:p>
     <w:p>
@@ -674,7 +674,7 @@
           <w:color w:val="232830"/>
           <w:sz w:val="19"/>
         </w:rPr>
-        <w:t>Disposition: skilled nursing facility versus home with home-health nursing per case management.</w:t>
+        <w:t>Disposition: discharge home with home-health nursing; home-based wound care criteria are met.</w:t>
       </w:r>
     </w:p>
     <w:p>
@@ -690,7 +690,7 @@
           <w:color w:val="232830"/>
           <w:sz w:val="19"/>
         </w:rPr>
-        <w:t>A transfer-day left foot radiograph was obtained on 05/24 and added to the chart imaging.</w:t>
+        <w:t>Therapy: physical and occupational therapy to complete the stair assessment before discharge.</w:t>
       </w:r>
     </w:p>
     <w:p>

</xml_diff>